<commit_message>
Subiendo el programa de Portal Sostenible
</commit_message>
<xml_diff>
--- a/Planteamiento del proyecto.docx
+++ b/Planteamiento del proyecto.docx
@@ -490,40 +490,25 @@
     <w:p/>
     <w:p>
       <w:r>
-        <w:t>Se deberá de realizar el diagrama entidad-relación con una herramienta software (a elegir</w:t>
-      </w:r>
-      <w:r>
-        <w:t xml:space="preserve"> </w:t>
-      </w:r>
-      <w:r>
-        <w:t>entre Miro, Dia, Yed, Draw.io ... ) acompañado de la tabla de descripción de entidades</w:t>
-      </w:r>
-      <w:r>
-        <w:t xml:space="preserve"> </w:t>
-      </w:r>
-      <w:r>
-        <w:t>que se adjunta a continuación y el diseño físico de la base de datos en un script SQL con</w:t>
-      </w:r>
-      <w:r>
-        <w:t xml:space="preserve"> </w:t>
-      </w:r>
-      <w:r>
-        <w:t>al menos 6 tablas.</w:t>
+        <w:t xml:space="preserve">Se deberá de realizar el diagrama entidad-relación con una herramienta software (a elegir entre Miro, Dia, Yed, Draw.io </w:t>
+      </w:r>
+      <w:r>
+        <w:t>...)</w:t>
+      </w:r>
+      <w:r>
+        <w:t xml:space="preserve"> acompañado de la tabla de descripción de entidades que se adjunta a continuación y el diseño físico de la base de datos en un script SQL con al menos 6 tablas.</w:t>
       </w:r>
     </w:p>
     <w:p>
       <w:r>
-        <w:t>Se debe aportar información detallada de cada una de las tablas, rellenando para cada una</w:t>
-      </w:r>
-      <w:r>
-        <w:t xml:space="preserve"> </w:t>
-      </w:r>
-      <w:r>
-        <w:t>de ellas una tabla como la siguiente:</w:t>
+        <w:t>Se debe aportar información detallada de cada una de las tablas, rellenando para cada una de ellas una tabla como la siguiente:</w:t>
       </w:r>
     </w:p>
     <w:p>
       <w:r>
+        <w:rPr>
+          <w:noProof/>
+        </w:rPr>
         <w:drawing>
           <wp:inline distT="0" distB="0" distL="0" distR="0" wp14:anchorId="70F9DC33" wp14:editId="3C81923B">
             <wp:extent cx="4618120" cy="2225233"/>
@@ -595,16 +580,19 @@
         <w:t xml:space="preserve"> </w:t>
       </w:r>
       <w:r>
-        <w:t>principios de la programación estructurada, el uso modular para organizar tu código,</w:t>
+        <w:t xml:space="preserve">principios de la programación estructurada, el uso modular para organizar tu </w:t>
+      </w:r>
+      <w:r>
+        <w:t>código,</w:t>
       </w:r>
       <w:r>
         <w:t xml:space="preserve"> </w:t>
       </w:r>
       <w:r>
-        <w:t xml:space="preserve"> </w:t>
-      </w:r>
-      <w:r>
-        <w:t>y la manipulación de vectores (arreglos) para gestionar los datos de manera eficiente.</w:t>
+        <w:t>y</w:t>
+      </w:r>
+      <w:r>
+        <w:t xml:space="preserve"> la manipulación de vectores (arreglos) para gestionar los datos de manera eficiente.</w:t>
       </w:r>
     </w:p>
     <w:p>
@@ -622,10 +610,7 @@
         <w:t xml:space="preserve"> </w:t>
       </w:r>
       <w:r>
-        <w:t xml:space="preserve"> </w:t>
-      </w:r>
-      <w:r>
-        <w:t>El desarrollo se realizará en el lenguaje que estás utilizando en tu formación actual.</w:t>
+        <w:t xml:space="preserve"> El desarrollo se realizará en el lenguaje que estás utilizando en tu formación actual.</w:t>
       </w:r>
     </w:p>
     <w:p>
@@ -643,10 +628,7 @@
         <w:t xml:space="preserve"> </w:t>
       </w:r>
       <w:r>
-        <w:t xml:space="preserve"> </w:t>
-      </w:r>
-      <w:r>
-        <w:t>Se espera que sigas el paradigma de la programación estructurada, utilizando bloques</w:t>
+        <w:t xml:space="preserve"> Se espera que sigas el paradigma de la programación estructurada, utilizando bloques</w:t>
       </w:r>
       <w:r>
         <w:t xml:space="preserve"> </w:t>
@@ -667,10 +649,7 @@
         <w:t xml:space="preserve">Modularidad: </w:t>
       </w:r>
       <w:r>
-        <w:t xml:space="preserve"> </w:t>
-      </w:r>
-      <w:r>
-        <w:t>La solución deberá dividirse en funciones o procedimientos que aborden tareas</w:t>
+        <w:t xml:space="preserve"> La solución deberá dividirse en funciones o procedimientos que aborden tareas</w:t>
       </w:r>
       <w:bookmarkStart w:id="0" w:name="_Hlk192030162"/>
       <w:r>
@@ -727,7 +706,13 @@
         <w:t xml:space="preserve"> </w:t>
       </w:r>
       <w:r>
-        <w:t>utilizaremos Xammp. Deben realizarse una serie de capturas para realizar unas</w:t>
+        <w:t xml:space="preserve">utilizaremos </w:t>
+      </w:r>
+      <w:r>
+        <w:t>Xampp</w:t>
+      </w:r>
+      <w:r>
+        <w:t>. Deben realizarse una serie de capturas para realizar unas</w:t>
       </w:r>
       <w:r>
         <w:t xml:space="preserve"> </w:t>
@@ -739,7 +724,13 @@
         <w:t xml:space="preserve"> </w:t>
       </w:r>
       <w:r>
-        <w:t>el Xamp.</w:t>
+        <w:t xml:space="preserve">el </w:t>
+      </w:r>
+      <w:r>
+        <w:t>Xampp</w:t>
+      </w:r>
+      <w:r>
+        <w:t>.</w:t>
       </w:r>
     </w:p>
     <w:p>
@@ -784,21 +775,7 @@
           <w:b/>
           <w:bCs/>
         </w:rPr>
-        <w:t>● Captura de las pantallas de instalación de Windows 10 (selección de idioma, particiones</w:t>
-      </w:r>
-      <w:r>
-        <w:rPr>
-          <w:b/>
-          <w:bCs/>
-        </w:rPr>
-        <w:t xml:space="preserve"> </w:t>
-      </w:r>
-      <w:r>
-        <w:rPr>
-          <w:b/>
-          <w:bCs/>
-        </w:rPr>
-        <w:t>y configuración inicial).</w:t>
+        <w:t>● Captura de las pantallas de instalación de Windows 10 (selección de idioma, particiones y configuración inicial).</w:t>
       </w:r>
     </w:p>
     <w:p/>
@@ -875,21 +852,30 @@
           <w:b/>
           <w:bCs/>
         </w:rPr>
-        <w:t>2. Uso de Ramas a lo largo del proyecto. Deberás estructurar el desarrollo del proyecto</w:t>
-      </w:r>
-      <w:r>
+        <w:t>2. Uso de Ramas a lo largo del proyecto. Deberás estructurar el desarrollo del proyecto utilizando ramas en Git para reflejar las diferentes etapas del trabajo</w:t>
+      </w:r>
+    </w:p>
+    <w:p>
+      <w:pPr>
+        <w:ind w:left="708"/>
         <w:rPr>
           <w:b/>
           <w:bCs/>
         </w:rPr>
-        <w:t xml:space="preserve"> </w:t>
-      </w:r>
+      </w:pPr>
       <w:r>
         <w:rPr>
           <w:b/>
           <w:bCs/>
         </w:rPr>
-        <w:t>utilizando ramas en Git para reflejar las diferentes etapas del trabajo</w:t>
+        <w:t>3. Subir el grafo de ramas</w:t>
+      </w:r>
+      <w:r>
+        <w:rPr>
+          <w:b/>
+          <w:bCs/>
+        </w:rPr>
+        <w:t>.</w:t>
       </w:r>
     </w:p>
     <w:p>
@@ -900,61 +886,86 @@
           <w:bCs/>
         </w:rPr>
       </w:pPr>
-      <w:r>
+    </w:p>
+    <w:p>
+      <w:pPr>
+        <w:ind w:left="708"/>
         <w:rPr>
           <w:b/>
           <w:bCs/>
         </w:rPr>
-        <w:t>3. Subir el grafo de ramas</w:t>
-      </w:r>
-      <w:r>
-        <w:rPr>
-          <w:b/>
-          <w:bCs/>
-        </w:rPr>
-        <w:t>.</w:t>
-      </w:r>
+      </w:pPr>
     </w:p>
     <w:p>
       <w:pPr>
-        <w:ind w:left="708"/>
-        <w:rPr>
-          <w:b/>
-          <w:bCs/>
-        </w:rPr>
-      </w:pPr>
+        <w:pStyle w:val="Ttulo1"/>
+      </w:pPr>
+      <w:r>
+        <w:t>Esquema:</w:t>
+      </w:r>
     </w:p>
     <w:p>
       <w:pPr>
-        <w:ind w:left="708"/>
-        <w:rPr>
-          <w:b/>
-          <w:bCs/>
-        </w:rPr>
-      </w:pPr>
+        <w:pStyle w:val="Titulo2"/>
+      </w:pPr>
+      <w:r>
+        <w:t>BASE DE DATOS</w:t>
+      </w:r>
     </w:p>
     <w:p>
       <w:pPr>
-        <w:pStyle w:val="Ttulo1"/>
-      </w:pPr>
-      <w:r>
-        <w:t>Esquema:</w:t>
-      </w:r>
-    </w:p>
-    <w:p>
-      <w:pPr>
-        <w:pStyle w:val="Titulo2"/>
-      </w:pPr>
-      <w:r>
-        <w:t>BASE DE DATOS</w:t>
-      </w:r>
-    </w:p>
-    <w:p>
-      <w:pPr>
         <w:ind w:left="360"/>
       </w:pPr>
       <w:r>
-        <w:t>En mi caso, me pondre a analizar el texto y sacar las ideas claves para haver un buen diseño del proyecto que desea el cliente, para ello es necesario leer el texto varias veces para sacar las ideas claves. En mi caso empezaré diseñando la Base de Datos por lo que analizaré el enunciado sacando las posibles entidades, atributos y relaciones y hacer una valoracion sobre cual será el modelo Entidad-Relacion que mejor conveniene y, por tanto, el que mas satisface la necesidades de nuestro cliente.</w:t>
+        <w:t xml:space="preserve">En mi caso, me </w:t>
+      </w:r>
+      <w:r>
+        <w:t>pondré</w:t>
+      </w:r>
+      <w:r>
+        <w:t xml:space="preserve"> a analizar el texto y sacar las ideas claves para </w:t>
+      </w:r>
+      <w:r>
+        <w:t>a ver</w:t>
+      </w:r>
+      <w:r>
+        <w:t xml:space="preserve"> un buen diseño del proyecto que desea el cliente, para ello es necesario leer el texto varias veces para sacar las ideas claves. En mi caso empezaré diseñando la Base de Datos por lo que analizaré el enunciado sacando las posibles entidades, atributos y relaciones y hacer una </w:t>
+      </w:r>
+      <w:r>
+        <w:t>valoración</w:t>
+      </w:r>
+      <w:r>
+        <w:t xml:space="preserve"> sobre </w:t>
+      </w:r>
+      <w:r>
+        <w:t>cuál</w:t>
+      </w:r>
+      <w:r>
+        <w:t xml:space="preserve"> será el modelo Entidad-</w:t>
+      </w:r>
+      <w:r>
+        <w:t>Relación</w:t>
+      </w:r>
+      <w:r>
+        <w:t xml:space="preserve"> que mejor </w:t>
+      </w:r>
+      <w:r>
+        <w:t>conveniente</w:t>
+      </w:r>
+      <w:r>
+        <w:t xml:space="preserve"> y, por tanto, el que </w:t>
+      </w:r>
+      <w:r>
+        <w:t>más</w:t>
+      </w:r>
+      <w:r>
+        <w:t xml:space="preserve"> satisface </w:t>
+      </w:r>
+      <w:r>
+        <w:t>las necesidades</w:t>
+      </w:r>
+      <w:r>
+        <w:t xml:space="preserve"> de nuestro cliente.</w:t>
       </w:r>
     </w:p>
     <w:p>
@@ -1094,7 +1105,19 @@
         <w:rPr>
           <w:highlight w:val="green"/>
         </w:rPr>
-        <w:t>Atributos multivaludado.</w:t>
+        <w:t xml:space="preserve">Atributos </w:t>
+      </w:r>
+      <w:r>
+        <w:rPr>
+          <w:highlight w:val="green"/>
+        </w:rPr>
+        <w:t>multivaluado</w:t>
+      </w:r>
+      <w:r>
+        <w:rPr>
+          <w:highlight w:val="green"/>
+        </w:rPr>
+        <w:t>.</w:t>
       </w:r>
     </w:p>
     <w:p>
@@ -1113,7 +1136,13 @@
         <w:rPr>
           <w:highlight w:val="red"/>
         </w:rPr>
-        <w:t>Releciones:</w:t>
+        <w:t>Relaciones</w:t>
+      </w:r>
+      <w:r>
+        <w:rPr>
+          <w:highlight w:val="red"/>
+        </w:rPr>
+        <w:t>:</w:t>
       </w:r>
     </w:p>
     <w:p>
@@ -1136,14 +1165,7 @@
           <w:i/>
           <w:iCs/>
         </w:rPr>
-        <w:t>“L</w:t>
-      </w:r>
-      <w:r>
-        <w:rPr>
-          <w:i/>
-          <w:iCs/>
-        </w:rPr>
-        <w:t xml:space="preserve">o primero es que tenemos estos </w:t>
+        <w:t xml:space="preserve">“Lo primero es que tenemos estos </w:t>
       </w:r>
       <w:r>
         <w:rPr>
@@ -1573,14 +1595,7 @@
           <w:i/>
           <w:iCs/>
         </w:rPr>
-        <w:t xml:space="preserve"> los eventos. Entonces, ellos tienen que poder entrar al sistema, crear nuevos eventos y, si es necesario, modificarlos. Me imagino que para cada organizador también habrá una especie de perfil con sus datos y los eventos que ha creado.</w:t>
-      </w:r>
-      <w:r>
-        <w:rPr>
-          <w:i/>
-          <w:iCs/>
-        </w:rPr>
-        <w:t>””</w:t>
+        <w:t xml:space="preserve"> los eventos. Entonces, ellos tienen que poder entrar al sistema, crear nuevos eventos y, si es necesario, modificarlos. Me imagino que para cada organizador también habrá una especie de perfil con sus datos y los eventos que ha creado.””</w:t>
       </w:r>
     </w:p>
     <w:p>
@@ -1588,7 +1603,10 @@
         <w:pStyle w:val="Ttulo3"/>
       </w:pPr>
       <w:r>
-        <w:t>Esquema Entidad-Relacion</w:t>
+        <w:t>Esquema Entidad-</w:t>
+      </w:r>
+      <w:r>
+        <w:t>Relación</w:t>
       </w:r>
     </w:p>
     <w:p>
@@ -1659,7 +1677,10 @@
       </w:pPr>
       <w:r>
         <w:lastRenderedPageBreak/>
-        <w:t>Informacion Detalla</w:t>
+        <w:t>Información</w:t>
+      </w:r>
+      <w:r>
+        <w:t xml:space="preserve"> Detalla</w:t>
       </w:r>
       <w:r>
         <w:t>da de las Tablas</w:t>
@@ -2154,7 +2175,10 @@
                   <w:jc w:val="center"/>
                 </w:pPr>
                 <w:r>
-                  <w:t>Cod _Perosna</w:t>
+                  <w:t>Cod _</w:t>
+                </w:r>
+                <w:r>
+                  <w:t>Persona</w:t>
                 </w:r>
               </w:p>
             </w:tc>
@@ -2169,7 +2193,16 @@
                   <w:cnfStyle w:val="000000100000" w:firstRow="0" w:lastRow="0" w:firstColumn="0" w:lastColumn="0" w:oddVBand="0" w:evenVBand="0" w:oddHBand="1" w:evenHBand="0" w:firstRowFirstColumn="0" w:firstRowLastColumn="0" w:lastRowFirstColumn="0" w:lastRowLastColumn="0"/>
                 </w:pPr>
                 <w:r>
-                  <w:t>Clave de todas las perosnas del sistemas</w:t>
+                  <w:t xml:space="preserve">Clave de todas las </w:t>
+                </w:r>
+                <w:r>
+                  <w:t>personas</w:t>
+                </w:r>
+                <w:r>
+                  <w:t xml:space="preserve"> </w:t>
+                </w:r>
+                <w:r>
+                  <w:t>del sistema</w:t>
                 </w:r>
               </w:p>
             </w:tc>
@@ -2606,7 +2639,35 @@
                     <w:b w:val="0"/>
                     <w:bCs w:val="0"/>
                   </w:rPr>
-                  <w:t>Id_Persona será la primary key, ademas es codigo para diferenciar usuarios y organizadores. Ejemplo: “User-001, ORG-001”.</w:t>
+                  <w:t xml:space="preserve">Id_Persona será la primary key, </w:t>
+                </w:r>
+                <w:r>
+                  <w:rPr>
+                    <w:b w:val="0"/>
+                    <w:bCs w:val="0"/>
+                  </w:rPr>
+                  <w:t>además</w:t>
+                </w:r>
+                <w:r>
+                  <w:rPr>
+                    <w:b w:val="0"/>
+                    <w:bCs w:val="0"/>
+                  </w:rPr>
+                  <w:t xml:space="preserve"> es </w:t>
+                </w:r>
+                <w:r>
+                  <w:rPr>
+                    <w:b w:val="0"/>
+                    <w:bCs w:val="0"/>
+                  </w:rPr>
+                  <w:t>código</w:t>
+                </w:r>
+                <w:r>
+                  <w:rPr>
+                    <w:b w:val="0"/>
+                    <w:bCs w:val="0"/>
+                  </w:rPr>
+                  <w:t xml:space="preserve"> para diferenciar usuarios y organizadores. Ejemplo: “User-001, ORG-001”.</w:t>
                 </w:r>
               </w:p>
             </w:tc>
@@ -3595,7 +3656,16 @@
               <w:cnfStyle w:val="000000100000" w:firstRow="0" w:lastRow="0" w:firstColumn="0" w:lastColumn="0" w:oddVBand="0" w:evenVBand="0" w:oddHBand="1" w:evenHBand="0" w:firstRowFirstColumn="0" w:firstRowLastColumn="0" w:lastRowFirstColumn="0" w:lastRowLastColumn="0"/>
             </w:pPr>
             <w:r>
-              <w:t>Clave de todas las perosnas del sistemas</w:t>
+              <w:t xml:space="preserve">Clave de todas las </w:t>
+            </w:r>
+            <w:r>
+              <w:t>personas</w:t>
+            </w:r>
+            <w:r>
+              <w:t xml:space="preserve"> </w:t>
+            </w:r>
+            <w:r>
+              <w:t>del sistema</w:t>
             </w:r>
           </w:p>
         </w:tc>
@@ -4380,7 +4450,10 @@
               <w:cnfStyle w:val="000000100000" w:firstRow="0" w:lastRow="0" w:firstColumn="0" w:lastColumn="0" w:oddVBand="0" w:evenVBand="0" w:oddHBand="1" w:evenHBand="0" w:firstRowFirstColumn="0" w:firstRowLastColumn="0" w:lastRowFirstColumn="0" w:lastRowLastColumn="0"/>
             </w:pPr>
             <w:r>
-              <w:t>Clave de los email</w:t>
+              <w:t xml:space="preserve">Clave </w:t>
+            </w:r>
+            <w:r>
+              <w:t>de los emails</w:t>
             </w:r>
           </w:p>
         </w:tc>
@@ -4514,7 +4587,10 @@
               <w:cnfStyle w:val="000000000000" w:firstRow="0" w:lastRow="0" w:firstColumn="0" w:lastColumn="0" w:oddVBand="0" w:evenVBand="0" w:oddHBand="0" w:evenHBand="0" w:firstRowFirstColumn="0" w:firstRowLastColumn="0" w:lastRowFirstColumn="0" w:lastRowLastColumn="0"/>
             </w:pPr>
             <w:r>
-              <w:t>Direccion de correo</w:t>
+              <w:t>Dirección</w:t>
+            </w:r>
+            <w:r>
+              <w:t xml:space="preserve"> de correo</w:t>
             </w:r>
           </w:p>
         </w:tc>
@@ -5141,7 +5217,16 @@
               <w:cnfStyle w:val="000000100000" w:firstRow="0" w:lastRow="0" w:firstColumn="0" w:lastColumn="0" w:oddVBand="0" w:evenVBand="0" w:oddHBand="1" w:evenHBand="0" w:firstRowFirstColumn="0" w:firstRowLastColumn="0" w:lastRowFirstColumn="0" w:lastRowLastColumn="0"/>
             </w:pPr>
             <w:r>
-              <w:t>Clave de todas las perosnas del sistemas</w:t>
+              <w:t xml:space="preserve">Clave de todas las </w:t>
+            </w:r>
+            <w:r>
+              <w:t>personas</w:t>
+            </w:r>
+            <w:r>
+              <w:t xml:space="preserve"> </w:t>
+            </w:r>
+            <w:r>
+              <w:t>del sistema</w:t>
             </w:r>
           </w:p>
         </w:tc>
@@ -5275,7 +5360,10 @@
               <w:cnfStyle w:val="000000000000" w:firstRow="0" w:lastRow="0" w:firstColumn="0" w:lastColumn="0" w:oddVBand="0" w:evenVBand="0" w:oddHBand="0" w:evenHBand="0" w:firstRowFirstColumn="0" w:firstRowLastColumn="0" w:lastRowFirstColumn="0" w:lastRowLastColumn="0"/>
             </w:pPr>
             <w:r>
-              <w:t>Telefono Fijo</w:t>
+              <w:t>Teléfono</w:t>
+            </w:r>
+            <w:r>
+              <w:t xml:space="preserve"> Fijo</w:t>
             </w:r>
           </w:p>
         </w:tc>
@@ -5410,7 +5498,13 @@
               <w:cnfStyle w:val="000000100000" w:firstRow="0" w:lastRow="0" w:firstColumn="0" w:lastColumn="0" w:oddVBand="0" w:evenVBand="0" w:oddHBand="1" w:evenHBand="0" w:firstRowFirstColumn="0" w:firstRowLastColumn="0" w:lastRowFirstColumn="0" w:lastRowLastColumn="0"/>
             </w:pPr>
             <w:r>
-              <w:t>Telefono Movil</w:t>
+              <w:t>Teléfono</w:t>
+            </w:r>
+            <w:r>
+              <w:t xml:space="preserve"> </w:t>
+            </w:r>
+            <w:r>
+              <w:t>Móvil</w:t>
             </w:r>
           </w:p>
         </w:tc>
@@ -5675,7 +5769,35 @@
                 <w:b w:val="0"/>
                 <w:bCs w:val="0"/>
               </w:rPr>
-              <w:t xml:space="preserve"> Id_Organizador será la primary key, COD_Persona será la Clave Foránea, el fijo y movil sera unique -&gt; +34 5646646543</w:t>
+              <w:t xml:space="preserve"> Id_Organizador será la primary key, COD_Persona será la Clave Foránea, el fijo y </w:t>
+            </w:r>
+            <w:r>
+              <w:rPr>
+                <w:b w:val="0"/>
+                <w:bCs w:val="0"/>
+              </w:rPr>
+              <w:t>móvil</w:t>
+            </w:r>
+            <w:r>
+              <w:rPr>
+                <w:b w:val="0"/>
+                <w:bCs w:val="0"/>
+              </w:rPr>
+              <w:t xml:space="preserve"> </w:t>
+            </w:r>
+            <w:r>
+              <w:rPr>
+                <w:b w:val="0"/>
+                <w:bCs w:val="0"/>
+              </w:rPr>
+              <w:t>será</w:t>
+            </w:r>
+            <w:r>
+              <w:rPr>
+                <w:b w:val="0"/>
+                <w:bCs w:val="0"/>
+              </w:rPr>
+              <w:t xml:space="preserve"> unique -&gt; +34 5646646543</w:t>
             </w:r>
           </w:p>
         </w:tc>
@@ -6581,7 +6703,16 @@
               <w:cnfStyle w:val="000000100000" w:firstRow="0" w:lastRow="0" w:firstColumn="0" w:lastColumn="0" w:oddVBand="0" w:evenVBand="0" w:oddHBand="1" w:evenHBand="0" w:firstRowFirstColumn="0" w:firstRowLastColumn="0" w:lastRowFirstColumn="0" w:lastRowLastColumn="0"/>
             </w:pPr>
             <w:r>
-              <w:t>Clave de todas las perosnas del sistemas</w:t>
+              <w:t xml:space="preserve">Clave de todas las </w:t>
+            </w:r>
+            <w:r>
+              <w:t>personas</w:t>
+            </w:r>
+            <w:r>
+              <w:t xml:space="preserve"> </w:t>
+            </w:r>
+            <w:r>
+              <w:t>del sistema</w:t>
             </w:r>
           </w:p>
         </w:tc>
@@ -7706,7 +7837,10 @@
               <w:cnfStyle w:val="000000000000" w:firstRow="0" w:lastRow="0" w:firstColumn="0" w:lastColumn="0" w:oddVBand="0" w:evenVBand="0" w:oddHBand="0" w:evenHBand="0" w:firstRowFirstColumn="0" w:firstRowLastColumn="0" w:lastRowFirstColumn="0" w:lastRowLastColumn="0"/>
             </w:pPr>
             <w:r>
-              <w:t>Tipo de categoria</w:t>
+              <w:t xml:space="preserve">Tipo de </w:t>
+            </w:r>
+            <w:r>
+              <w:t>categoría</w:t>
             </w:r>
           </w:p>
         </w:tc>
@@ -7974,7 +8108,35 @@
                 <w:b w:val="0"/>
                 <w:bCs w:val="0"/>
               </w:rPr>
-              <w:t xml:space="preserve"> Cod_Categoria será la primary key, COD_Evento será la Clave Foránea,  Nombre tendrá una restriccion de Check solo puede tener los valores “</w:t>
+              <w:t xml:space="preserve"> Cod_Categoria será la primary key, COD_Evento será la Clave </w:t>
+            </w:r>
+            <w:r>
+              <w:rPr>
+                <w:b w:val="0"/>
+                <w:bCs w:val="0"/>
+              </w:rPr>
+              <w:t>Foránea, Nombre</w:t>
+            </w:r>
+            <w:r>
+              <w:rPr>
+                <w:b w:val="0"/>
+                <w:bCs w:val="0"/>
+              </w:rPr>
+              <w:t xml:space="preserve"> tendrá una </w:t>
+            </w:r>
+            <w:r>
+              <w:rPr>
+                <w:b w:val="0"/>
+                <w:bCs w:val="0"/>
+              </w:rPr>
+              <w:t>restricción</w:t>
+            </w:r>
+            <w:r>
+              <w:rPr>
+                <w:b w:val="0"/>
+                <w:bCs w:val="0"/>
+              </w:rPr>
+              <w:t xml:space="preserve"> de Check solo puede tener los valores “</w:t>
             </w:r>
             <w:r>
               <w:rPr>
@@ -8714,7 +8876,35 @@
                 <w:b w:val="0"/>
                 <w:bCs w:val="0"/>
               </w:rPr>
-              <w:t xml:space="preserve"> Cod_Ubicacion será la primary key, COD_Evento será la Clave Foránea,   Nombre tendrá una restriccion de Check solo puede tener los valores “</w:t>
+              <w:t xml:space="preserve"> Cod_Ubicacion será la primary key, COD_Evento será la Clave </w:t>
+            </w:r>
+            <w:r>
+              <w:rPr>
+                <w:b w:val="0"/>
+                <w:bCs w:val="0"/>
+              </w:rPr>
+              <w:t>Foránea, Nombre</w:t>
+            </w:r>
+            <w:r>
+              <w:rPr>
+                <w:b w:val="0"/>
+                <w:bCs w:val="0"/>
+              </w:rPr>
+              <w:t xml:space="preserve"> tendrá una </w:t>
+            </w:r>
+            <w:r>
+              <w:rPr>
+                <w:b w:val="0"/>
+                <w:bCs w:val="0"/>
+              </w:rPr>
+              <w:t>restricción</w:t>
+            </w:r>
+            <w:r>
+              <w:rPr>
+                <w:b w:val="0"/>
+                <w:bCs w:val="0"/>
+              </w:rPr>
+              <w:t xml:space="preserve"> de Check solo puede tener los valores “</w:t>
             </w:r>
             <w:r>
               <w:rPr>
@@ -8744,7 +8934,10 @@
         <w:pStyle w:val="Ttulo3"/>
       </w:pPr>
       <w:r>
-        <w:t>Transformacion a Modelo Relacional:</w:t>
+        <w:t>Transformación</w:t>
+      </w:r>
+      <w:r>
+        <w:t xml:space="preserve"> a Modelo Relacional:</w:t>
       </w:r>
     </w:p>
     <w:p>
@@ -8752,6 +8945,9 @@
         <w:ind w:left="-567"/>
       </w:pPr>
       <w:r>
+        <w:rPr>
+          <w:noProof/>
+        </w:rPr>
         <w:drawing>
           <wp:inline distT="0" distB="0" distL="0" distR="0" wp14:anchorId="0CFBEEC5" wp14:editId="2F4070C3">
             <wp:extent cx="7341399" cy="2917825"/>
@@ -8807,13 +9003,10 @@
         <w:pStyle w:val="Ttulo3"/>
       </w:pPr>
       <w:r>
-        <w:t>Transformacion a Modelo Relacional</w:t>
-      </w:r>
-      <w:r>
-        <w:t xml:space="preserve"> a SQL</w:t>
-      </w:r>
-      <w:r>
-        <w:t>:</w:t>
+        <w:t>Transformación</w:t>
+      </w:r>
+      <w:r>
+        <w:t xml:space="preserve"> a Modelo Relacional a SQL:</w:t>
       </w:r>
     </w:p>
     <w:p>
@@ -8832,8 +9025,14 @@
       <w:pPr>
         <w:pStyle w:val="Prrafodelista"/>
         <w:ind w:left="360"/>
-      </w:pPr>
-      <w:r>
+        <w:rPr>
+          <w:lang w:val="en-GB"/>
+        </w:rPr>
+      </w:pPr>
+      <w:r>
+        <w:rPr>
+          <w:lang w:val="en-GB"/>
+        </w:rPr>
         <w:t>alter session set "_oracle_script"=true;</w:t>
       </w:r>
     </w:p>
@@ -8841,8 +9040,14 @@
       <w:pPr>
         <w:pStyle w:val="Prrafodelista"/>
         <w:ind w:left="360"/>
-      </w:pPr>
-      <w:r>
+        <w:rPr>
+          <w:lang w:val="en-GB"/>
+        </w:rPr>
+      </w:pPr>
+      <w:r>
+        <w:rPr>
+          <w:lang w:val="en-GB"/>
+        </w:rPr>
         <w:t>alter user system identified by SYS;</w:t>
       </w:r>
     </w:p>
@@ -8868,8 +9073,14 @@
       <w:pPr>
         <w:pStyle w:val="Prrafodelista"/>
         <w:ind w:left="360"/>
-      </w:pPr>
-      <w:r>
+        <w:rPr>
+          <w:lang w:val="en-GB"/>
+        </w:rPr>
+      </w:pPr>
+      <w:r>
+        <w:rPr>
+          <w:lang w:val="en-GB"/>
+        </w:rPr>
         <w:t>grant connect, resource to Proyecto_Indra;</w:t>
       </w:r>
     </w:p>
@@ -8877,6 +9088,9 @@
       <w:pPr>
         <w:pStyle w:val="Prrafodelista"/>
         <w:ind w:left="360"/>
+        <w:rPr>
+          <w:lang w:val="en-GB"/>
+        </w:rPr>
       </w:pPr>
     </w:p>
     <w:p>
@@ -8901,8 +9115,14 @@
       <w:pPr>
         <w:pStyle w:val="Prrafodelista"/>
         <w:ind w:left="360"/>
-      </w:pPr>
-      <w:r>
+        <w:rPr>
+          <w:lang w:val="en-GB"/>
+        </w:rPr>
+      </w:pPr>
+      <w:r>
+        <w:rPr>
+          <w:lang w:val="en-GB"/>
+        </w:rPr>
         <w:lastRenderedPageBreak/>
         <w:t>default TABLESPACE users</w:t>
       </w:r>
@@ -8911,8 +9131,14 @@
       <w:pPr>
         <w:pStyle w:val="Prrafodelista"/>
         <w:ind w:left="360"/>
-      </w:pPr>
-      <w:r>
+        <w:rPr>
+          <w:lang w:val="en-GB"/>
+        </w:rPr>
+      </w:pPr>
+      <w:r>
+        <w:rPr>
+          <w:lang w:val="en-GB"/>
+        </w:rPr>
         <w:t>TEMPORARY tablespace temp;</w:t>
       </w:r>
     </w:p>
@@ -8920,6 +9146,9 @@
       <w:pPr>
         <w:pStyle w:val="Prrafodelista"/>
         <w:ind w:left="360"/>
+        <w:rPr>
+          <w:lang w:val="en-GB"/>
+        </w:rPr>
       </w:pPr>
     </w:p>
     <w:p>
@@ -8935,15 +9164,36 @@
       <w:pPr>
         <w:pStyle w:val="Prrafodelista"/>
         <w:ind w:left="360"/>
-      </w:pPr>
-      <w:r>
-        <w:t>alter user Proyecto_Indra  quota unlimited on users;</w:t>
+        <w:rPr>
+          <w:lang w:val="en-GB"/>
+        </w:rPr>
+      </w:pPr>
+      <w:r>
+        <w:rPr>
+          <w:lang w:val="en-GB"/>
+        </w:rPr>
+        <w:t>alter user Proyecto_</w:t>
+      </w:r>
+      <w:r>
+        <w:rPr>
+          <w:lang w:val="en-GB"/>
+        </w:rPr>
+        <w:t>Indra quota</w:t>
+      </w:r>
+      <w:r>
+        <w:rPr>
+          <w:lang w:val="en-GB"/>
+        </w:rPr>
+        <w:t xml:space="preserve"> unlimited on users;</w:t>
       </w:r>
     </w:p>
     <w:p>
       <w:pPr>
         <w:pStyle w:val="Prrafodelista"/>
         <w:ind w:left="360"/>
+        <w:rPr>
+          <w:lang w:val="en-GB"/>
+        </w:rPr>
       </w:pPr>
     </w:p>
     <w:p>
@@ -8964,6 +9214,9 @@
         <w:ind w:left="-567"/>
       </w:pPr>
       <w:r>
+        <w:rPr>
+          <w:noProof/>
+        </w:rPr>
         <w:drawing>
           <wp:inline distT="0" distB="0" distL="0" distR="0" wp14:anchorId="11192954" wp14:editId="45170345">
             <wp:extent cx="7296645" cy="2646045"/>
@@ -9014,16 +9267,71 @@
       </w:pPr>
     </w:p>
     <w:p>
-      <w:r>
-        <w:br w:type="page"/>
-      </w:r>
-      <w:r>
-        <w:lastRenderedPageBreak/>
+      <w:pPr>
+        <w:tabs>
+          <w:tab w:val="left" w:pos="2073"/>
+        </w:tabs>
+      </w:pPr>
+    </w:p>
+    <w:p>
+      <w:pPr>
+        <w:tabs>
+          <w:tab w:val="left" w:pos="2073"/>
+        </w:tabs>
+      </w:pPr>
+    </w:p>
+    <w:p>
+      <w:pPr>
+        <w:pStyle w:val="Titulo2"/>
+      </w:pPr>
+      <w:r>
+        <w:t>Lenguaje de Marcas:</w:t>
+      </w:r>
+    </w:p>
+    <w:p>
+      <w:pPr>
+        <w:ind w:left="360"/>
+      </w:pPr>
+      <w:r>
+        <w:t xml:space="preserve">Teniendo en cuenta lo que se pide el enuncia voy a crear una pagina web que </w:t>
+      </w:r>
+      <w:r>
+        <w:t>contengan</w:t>
+      </w:r>
+      <w:r>
+        <w:t xml:space="preserve"> los elementos que se piden. En mi caso, voy a partir de una estructura en donde voy a alojar mi pagina web dentro de la carpeta </w:t>
+      </w:r>
+      <w:r>
+        <w:t>Lenguaje Marcas</w:t>
+      </w:r>
+      <w:r>
+        <w:t xml:space="preserve"> estará el index.html, y las carpetas img (</w:t>
+      </w:r>
+      <w:r>
+        <w:t>imágenes</w:t>
+      </w:r>
+      <w:r>
+        <w:t>), html y css.</w:t>
+      </w:r>
+    </w:p>
+    <w:p>
+      <w:pPr>
+        <w:ind w:left="360"/>
+      </w:pPr>
+      <w:r>
+        <w:t>En el diseño me inspirado un poco en la naturaleza pues es un portal sostenible, por lo que he usado una paleta de colores con tonos verdes:</w:t>
+      </w:r>
+    </w:p>
+    <w:p>
+      <w:pPr>
+        <w:ind w:left="360"/>
+      </w:pPr>
+      <w:r>
         <w:drawing>
-          <wp:inline distT="0" distB="0" distL="0" distR="0" wp14:anchorId="13440C79" wp14:editId="33488869">
-            <wp:extent cx="6635115" cy="2353310"/>
-            <wp:effectExtent l="0" t="0" r="0" b="8890"/>
-            <wp:docPr id="1110727814" name="Imagen 1"/>
+          <wp:inline distT="0" distB="0" distL="0" distR="0" wp14:anchorId="40D605AC" wp14:editId="6DA46E8C">
+            <wp:extent cx="5951736" cy="1272650"/>
+            <wp:effectExtent l="0" t="0" r="0" b="3810"/>
+            <wp:docPr id="823832104" name="Imagen 1"/>
             <wp:cNvGraphicFramePr>
               <a:graphicFrameLocks xmlns:a="http://schemas.openxmlformats.org/drawingml/2006/main" noChangeAspect="1"/>
             </wp:cNvGraphicFramePr>
@@ -9031,11 +9339,11 @@
               <a:graphicData uri="http://schemas.openxmlformats.org/drawingml/2006/picture">
                 <pic:pic xmlns:pic="http://schemas.openxmlformats.org/drawingml/2006/picture">
                   <pic:nvPicPr>
-                    <pic:cNvPr id="1110727814" name=""/>
+                    <pic:cNvPr id="823832104" name=""/>
                     <pic:cNvPicPr/>
                   </pic:nvPicPr>
                   <pic:blipFill>
-                    <a:blip r:embed="rId10"/>
+                    <a:blip r:embed="rId11"/>
                     <a:stretch>
                       <a:fillRect/>
                     </a:stretch>
@@ -9043,7 +9351,7 @@
                   <pic:spPr>
                     <a:xfrm>
                       <a:off x="0" y="0"/>
-                      <a:ext cx="6635115" cy="2353310"/>
+                      <a:ext cx="5951736" cy="1272650"/>
                     </a:xfrm>
                     <a:prstGeom prst="rect">
                       <a:avLst/>
@@ -9054,6 +9362,129 @@
             </a:graphic>
           </wp:inline>
         </w:drawing>
+      </w:r>
+    </w:p>
+    <w:p>
+      <w:pPr>
+        <w:ind w:left="360"/>
+      </w:pPr>
+      <w:r>
+        <w:t>La pagina web contiene elementos de navegación, formularios, lista desplegable entre otras cosas</w:t>
+      </w:r>
+      <w:r>
+        <w:t xml:space="preserve">, en </w:t>
+      </w:r>
+      <w:proofErr w:type="gramStart"/>
+      <w:r>
+        <w:t>la siguientes imágenes</w:t>
+      </w:r>
+      <w:proofErr w:type="gramEnd"/>
+      <w:r>
+        <w:t xml:space="preserve"> se muestra un vista previa.</w:t>
+      </w:r>
+    </w:p>
+    <w:p>
+      <w:r>
+        <w:lastRenderedPageBreak/>
+        <w:br/>
+      </w:r>
+      <w:r>
+        <w:drawing>
+          <wp:inline distT="0" distB="0" distL="0" distR="0" wp14:anchorId="1BDB9BB8" wp14:editId="0308A0E6">
+            <wp:extent cx="6635115" cy="3182620"/>
+            <wp:effectExtent l="19050" t="19050" r="13335" b="17780"/>
+            <wp:docPr id="1592560846" name="Imagen 1"/>
+            <wp:cNvGraphicFramePr>
+              <a:graphicFrameLocks xmlns:a="http://schemas.openxmlformats.org/drawingml/2006/main" noChangeAspect="1"/>
+            </wp:cNvGraphicFramePr>
+            <a:graphic xmlns:a="http://schemas.openxmlformats.org/drawingml/2006/main">
+              <a:graphicData uri="http://schemas.openxmlformats.org/drawingml/2006/picture">
+                <pic:pic xmlns:pic="http://schemas.openxmlformats.org/drawingml/2006/picture">
+                  <pic:nvPicPr>
+                    <pic:cNvPr id="1592560846" name=""/>
+                    <pic:cNvPicPr/>
+                  </pic:nvPicPr>
+                  <pic:blipFill>
+                    <a:blip r:embed="rId12"/>
+                    <a:stretch>
+                      <a:fillRect/>
+                    </a:stretch>
+                  </pic:blipFill>
+                  <pic:spPr>
+                    <a:xfrm>
+                      <a:off x="0" y="0"/>
+                      <a:ext cx="6635115" cy="3182620"/>
+                    </a:xfrm>
+                    <a:prstGeom prst="rect">
+                      <a:avLst/>
+                    </a:prstGeom>
+                    <a:ln>
+                      <a:solidFill>
+                        <a:schemeClr val="tx1"/>
+                      </a:solidFill>
+                    </a:ln>
+                  </pic:spPr>
+                </pic:pic>
+              </a:graphicData>
+            </a:graphic>
+          </wp:inline>
+        </w:drawing>
+      </w:r>
+    </w:p>
+    <w:p>
+      <w:r>
+        <w:drawing>
+          <wp:inline distT="0" distB="0" distL="0" distR="0" wp14:anchorId="34085B92" wp14:editId="73F51861">
+            <wp:extent cx="6635115" cy="3518535"/>
+            <wp:effectExtent l="19050" t="19050" r="13335" b="24765"/>
+            <wp:docPr id="454317329" name="Imagen 1"/>
+            <wp:cNvGraphicFramePr>
+              <a:graphicFrameLocks xmlns:a="http://schemas.openxmlformats.org/drawingml/2006/main" noChangeAspect="1"/>
+            </wp:cNvGraphicFramePr>
+            <a:graphic xmlns:a="http://schemas.openxmlformats.org/drawingml/2006/main">
+              <a:graphicData uri="http://schemas.openxmlformats.org/drawingml/2006/picture">
+                <pic:pic xmlns:pic="http://schemas.openxmlformats.org/drawingml/2006/picture">
+                  <pic:nvPicPr>
+                    <pic:cNvPr id="454317329" name=""/>
+                    <pic:cNvPicPr/>
+                  </pic:nvPicPr>
+                  <pic:blipFill>
+                    <a:blip r:embed="rId13"/>
+                    <a:stretch>
+                      <a:fillRect/>
+                    </a:stretch>
+                  </pic:blipFill>
+                  <pic:spPr>
+                    <a:xfrm>
+                      <a:off x="0" y="0"/>
+                      <a:ext cx="6635115" cy="3518535"/>
+                    </a:xfrm>
+                    <a:prstGeom prst="rect">
+                      <a:avLst/>
+                    </a:prstGeom>
+                    <a:ln>
+                      <a:solidFill>
+                        <a:schemeClr val="tx1"/>
+                      </a:solidFill>
+                    </a:ln>
+                  </pic:spPr>
+                </pic:pic>
+              </a:graphicData>
+            </a:graphic>
+          </wp:inline>
+        </w:drawing>
+      </w:r>
+    </w:p>
+    <w:p>
+      <w:pPr>
+        <w:tabs>
+          <w:tab w:val="left" w:pos="2073"/>
+        </w:tabs>
+      </w:pPr>
+    </w:p>
+    <w:p>
+      <w:r>
+        <w:br w:type="page"/>
       </w:r>
     </w:p>
     <w:sectPr>
@@ -9883,6 +10314,7 @@
     <w:lvl w:ilvl="0" w:tplc="818069DA">
       <w:start w:val="1"/>
       <w:numFmt w:val="decimal"/>
+      <w:pStyle w:val="Estilo1"/>
       <w:lvlText w:val="%1."/>
       <w:lvlJc w:val="left"/>
       <w:pPr>
@@ -11278,6 +11710,7 @@
   <w:style w:type="character" w:default="1" w:styleId="Fuentedeprrafopredeter">
     <w:name w:val="Default Paragraph Font"/>
     <w:uiPriority w:val="1"/>
+    <w:semiHidden/>
     <w:unhideWhenUsed/>
   </w:style>
   <w:style w:type="table" w:default="1" w:styleId="Tablanormal">
@@ -11714,8 +12147,9 @@
     <w:rsid w:val="008C2361"/>
     <w:pPr>
       <w:numPr>
-        <w:ilvl w:val="1"/>
+        <w:numId w:val="0"/>
       </w:numPr>
+      <w:ind w:left="792" w:hanging="432"/>
     </w:pPr>
   </w:style>
   <w:style w:type="character" w:customStyle="1" w:styleId="Titulo2Car">

</xml_diff>